<commit_message>
Fix Word template pagination and appendix numbering
</commit_message>
<xml_diff>
--- a/AI4X-2027.docx
+++ b/AI4X-2027.docx
@@ -206,7 +206,7 @@
         <w:t xml:space="preserve">Olympus Academy of Mountaineering, Mytikas, Greece 402 00</w:t>
       </w:r>
       <w:r>
-        <w:t xml:space="preserve"> </w:t>
+        <w:br/>
       </w:r>
       <w:r>
         <w:rPr>
@@ -305,30 +305,6 @@
       </w:pPr>
       <w:r>
         <w:t xml:space="preserve">AI4X is non-archival: an accepted abstract is not a formal publication, so you are free to publish the work later in a journal or in conference proceedings.</w:t>
-      </w:r>
-    </w:p>
-    <w:p>
-      <w:pPr>
-        <w:pStyle w:val="Heading1"/>
-      </w:pPr>
-      <w:r>
-        <w:t xml:space="preserve">Working with the template</w:t>
-      </w:r>
-    </w:p>
-    <w:p>
-      <w:pPr>
-        <w:pStyle w:val="FirstParagraph"/>
-      </w:pPr>
-      <w:r>
-        <w:t xml:space="preserve">Use the styles of the template: Heading 1 and Heading 2 number the sections, Unnumbered Heading is for the acknowledgments and references, and Appendix Heading for the appendices. The numbers of the figures, tables, and equations, and the references to them, are fields: after moving things around, select all (Ctrl+A) and press F9 to update them.</w:t>
-      </w:r>
-    </w:p>
-    <w:p>
-      <w:pPr>
-        <w:pStyle w:val="BodyText"/>
-      </w:pPr>
-      <w:r>
-        <w:t xml:space="preserve">The template embeds its font, Source Serif 4, so it looks the same on computers that do not have the font installed. Please submit a PDF, and check in it that the bold and italic text and the equations look right. Fill the title, the authors, and the keywords in File → Info → Properties: they become the PDF metadata, which improves search discoverability.</w:t>
       </w:r>
     </w:p>
     <w:p>
@@ -733,6 +709,7 @@
       <w:pPr>
         <w:pStyle w:val="Caption"/>
         <w:keepNext/>
+        <w:keepLines/>
       </w:pPr>
       <w:bookmarkStart w:id="3" w:name="_Ref270000002"/>
       <w:r>
@@ -789,6 +766,7 @@
       </w:tblGrid>
       <w:tr>
         <w:trPr>
+          <w:cantSplit/>
           <w:tblHeader/>
         </w:trPr>
         <w:tc>
@@ -806,6 +784,8 @@
           <w:p>
             <w:pPr>
               <w:pStyle w:val="TableText"/>
+              <w:keepNext/>
+              <w:keepLines/>
             </w:pPr>
             <w:r>
               <w:t xml:space="preserve">Model</w:t>
@@ -827,6 +807,8 @@
           <w:p>
             <w:pPr>
               <w:pStyle w:val="TableText"/>
+              <w:keepNext/>
+              <w:keepLines/>
               <w:jc w:val="center"/>
             </w:pPr>
             <w:r>
@@ -855,6 +837,8 @@
           <w:p>
             <w:pPr>
               <w:pStyle w:val="TableText"/>
+              <w:keepNext/>
+              <w:keepLines/>
               <w:jc w:val="center"/>
             </w:pPr>
             <w:r>
@@ -890,6 +874,8 @@
           <w:p>
             <w:pPr>
               <w:pStyle w:val="TableText"/>
+              <w:keepNext/>
+              <w:keepLines/>
               <w:jc w:val="center"/>
             </w:pPr>
             <w:r>
@@ -905,6 +891,9 @@
         </w:tc>
       </w:tr>
       <w:tr>
+        <w:trPr>
+          <w:cantSplit/>
+        </w:trPr>
         <w:tc>
           <w:tcPr>
             <w:tcW w:w="1572" w:type="dxa"/>
@@ -915,6 +904,8 @@
           <w:p>
             <w:pPr>
               <w:pStyle w:val="TableText"/>
+              <w:keepNext/>
+              <w:keepLines/>
             </w:pPr>
             <w:r>
               <w:t xml:space="preserve">Random forest</w:t>
@@ -931,6 +922,8 @@
           <w:p>
             <w:pPr>
               <w:pStyle w:val="TableText"/>
+              <w:keepNext/>
+              <w:keepLines/>
               <w:jc w:val="center"/>
             </w:pPr>
             <w:r>
@@ -948,6 +941,8 @@
           <w:p>
             <w:pPr>
               <w:pStyle w:val="TableText"/>
+              <w:keepNext/>
+              <w:keepLines/>
               <w:jc w:val="center"/>
             </w:pPr>
             <w:r>
@@ -965,6 +960,8 @@
           <w:p>
             <w:pPr>
               <w:pStyle w:val="TableText"/>
+              <w:keepNext/>
+              <w:keepLines/>
               <w:jc w:val="center"/>
             </w:pPr>
             <w:r>
@@ -978,6 +975,9 @@
         </w:tc>
       </w:tr>
       <w:tr>
+        <w:trPr>
+          <w:cantSplit/>
+        </w:trPr>
         <w:tc>
           <w:tcPr>
             <w:tcW w:w="1572" w:type="dxa"/>
@@ -985,6 +985,8 @@
           <w:p>
             <w:pPr>
               <w:pStyle w:val="TableText"/>
+              <w:keepNext/>
+              <w:keepLines/>
             </w:pPr>
             <w:r>
               <w:t xml:space="preserve">GNN</w:t>
@@ -998,6 +1000,8 @@
           <w:p>
             <w:pPr>
               <w:pStyle w:val="TableText"/>
+              <w:keepNext/>
+              <w:keepLines/>
               <w:jc w:val="center"/>
             </w:pPr>
             <w:r>
@@ -1012,6 +1016,8 @@
           <w:p>
             <w:pPr>
               <w:pStyle w:val="TableText"/>
+              <w:keepNext/>
+              <w:keepLines/>
               <w:jc w:val="center"/>
             </w:pPr>
             <w:r>
@@ -1026,6 +1032,8 @@
           <w:p>
             <w:pPr>
               <w:pStyle w:val="TableText"/>
+              <w:keepNext/>
+              <w:keepLines/>
               <w:jc w:val="center"/>
             </w:pPr>
             <w:r>
@@ -1035,6 +1043,9 @@
         </w:tc>
       </w:tr>
       <w:tr>
+        <w:trPr>
+          <w:cantSplit/>
+        </w:trPr>
         <w:tc>
           <w:tcPr>
             <w:tcW w:w="1572" w:type="dxa"/>
@@ -1048,6 +1059,7 @@
           <w:p>
             <w:pPr>
               <w:pStyle w:val="TableText"/>
+              <w:keepLines/>
             </w:pPr>
             <w:r>
               <w:t xml:space="preserve">Ours</w:t>
@@ -1067,6 +1079,7 @@
           <w:p>
             <w:pPr>
               <w:pStyle w:val="TableText"/>
+              <w:keepLines/>
               <w:jc w:val="center"/>
             </w:pPr>
             <w:r>
@@ -1091,6 +1104,7 @@
           <w:p>
             <w:pPr>
               <w:pStyle w:val="TableText"/>
+              <w:keepLines/>
               <w:jc w:val="center"/>
             </w:pPr>
             <w:r>
@@ -1115,6 +1129,7 @@
           <w:p>
             <w:pPr>
               <w:pStyle w:val="TableText"/>
+              <w:keepLines/>
               <w:jc w:val="center"/>
             </w:pPr>
             <w:r>
@@ -1124,6 +1139,30 @@
         </w:tc>
       </w:tr>
     </w:tbl>
+    <w:p>
+      <w:pPr>
+        <w:pStyle w:val="Heading1"/>
+      </w:pPr>
+      <w:r>
+        <w:t xml:space="preserve">Working with the template</w:t>
+      </w:r>
+    </w:p>
+    <w:p>
+      <w:pPr>
+        <w:pStyle w:val="FirstParagraph"/>
+      </w:pPr>
+      <w:r>
+        <w:t xml:space="preserve">Use the styles of the template: Heading 1 and Heading 2 number the sections, Unnumbered Heading is for the acknowledgments and references. Use Appendix Heading for appendices, and Appendix Heading 2 and Appendix Heading 3 for their subsections. The numbers of the figures, tables, and equations, and the references to them, are fields: after moving things around, select all (Ctrl+A) and press F9 to update them.</w:t>
+      </w:r>
+    </w:p>
+    <w:p>
+      <w:pPr>
+        <w:pStyle w:val="BodyText"/>
+      </w:pPr>
+      <w:r>
+        <w:t xml:space="preserve">The template embeds its font, Source Serif 4, so it looks the same on computers that do not have the font installed. Please submit a PDF, and check in it that the bold and italic text and the equations look right. Fill the title, the authors, and the keywords in File → Info → Properties: they become the PDF metadata, which improves search discoverability.</w:t>
+      </w:r>
+    </w:p>
     <w:p>
       <w:pPr>
         <w:pStyle w:val="UnnumberedHeading"/>
@@ -1613,13 +1652,35 @@
     </w:lvl>
   </w:abstractNum>
   <w:abstractNum w:abstractNumId="1">
-    <w:multiLevelType w:val="singleLevel"/>
+    <w:multiLevelType w:val="multilevel"/>
     <w:lvl w:ilvl="0">
       <w:start w:val="1"/>
       <w:numFmt w:val="upperLetter"/>
       <w:pStyle w:val="AppendixHeading"/>
       <w:suff w:val="space"/>
       <w:lvlText w:val="Appendix %1."/>
+      <w:lvlJc w:val="left"/>
+      <w:pPr>
+        <w:ind w:left="0" w:firstLine="0"/>
+      </w:pPr>
+    </w:lvl>
+    <w:lvl w:ilvl="1">
+      <w:start w:val="1"/>
+      <w:numFmt w:val="decimal"/>
+      <w:pStyle w:val="AppendixHeading2"/>
+      <w:suff w:val="space"/>
+      <w:lvlText w:val="%1.%2."/>
+      <w:lvlJc w:val="left"/>
+      <w:pPr>
+        <w:ind w:left="0" w:firstLine="0"/>
+      </w:pPr>
+    </w:lvl>
+    <w:lvl w:ilvl="2">
+      <w:start w:val="1"/>
+      <w:numFmt w:val="decimal"/>
+      <w:pStyle w:val="AppendixHeading3"/>
+      <w:suff w:val="space"/>
+      <w:lvlText w:val="%1.%2.%3."/>
       <w:lvlJc w:val="left"/>
       <w:pPr>
         <w:ind w:left="0" w:firstLine="0"/>
@@ -1728,6 +1789,7 @@
     <w:qFormat/>
     <w:pPr>
       <w:keepNext/>
+      <w:suppressAutoHyphens/>
       <w:spacing w:before="0" w:after="0" w:line="214" w:lineRule="auto"/>
       <w:jc w:val="center"/>
     </w:pPr>
@@ -1851,6 +1913,48 @@
     <w:rPr>
       <w:b/>
       <w:bCs/>
+    </w:rPr>
+  </w:style>
+  <w:style w:type="paragraph" w:customStyle="1" w:styleId="AppendixHeading2">
+    <w:name w:val="Appendix Heading 2"/>
+    <w:basedOn w:val="Normal"/>
+    <w:next w:val="FirstParagraph"/>
+    <w:qFormat/>
+    <w:pPr>
+      <w:keepNext/>
+      <w:keepLines/>
+      <w:numPr>
+        <w:ilvl w:val="1"/>
+        <w:numId w:val="2"/>
+      </w:numPr>
+      <w:spacing w:before="300" w:after="20" w:line="210" w:lineRule="auto"/>
+      <w:jc w:val="left"/>
+      <w:outlineLvl w:val="1"/>
+    </w:pPr>
+    <w:rPr>
+      <w:i/>
+      <w:iCs/>
+    </w:rPr>
+  </w:style>
+  <w:style w:type="paragraph" w:customStyle="1" w:styleId="AppendixHeading3">
+    <w:name w:val="Appendix Heading 3"/>
+    <w:basedOn w:val="Normal"/>
+    <w:next w:val="FirstParagraph"/>
+    <w:qFormat/>
+    <w:pPr>
+      <w:keepNext/>
+      <w:keepLines/>
+      <w:numPr>
+        <w:ilvl w:val="2"/>
+        <w:numId w:val="2"/>
+      </w:numPr>
+      <w:spacing w:before="300" w:after="20" w:line="210" w:lineRule="auto"/>
+      <w:jc w:val="left"/>
+      <w:outlineLvl w:val="2"/>
+    </w:pPr>
+    <w:rPr>
+      <w:i/>
+      <w:iCs/>
     </w:rPr>
   </w:style>
   <w:style w:type="paragraph" w:styleId="Caption">

</xml_diff>

<commit_message>
Word biography to use common style
</commit_message>
<xml_diff>
--- a/AI4X-2027.docx
+++ b/AI4X-2027.docx
@@ -296,31 +296,7 @@
         <w:pStyle w:val="BodyText"/>
       </w:pPr>
       <w:r>
-        <w:t xml:space="preserve">The review is single-blind: the reviewers see the </w:t>
-      </w:r>
-      <w:proofErr w:type="gramStart"/>
-      <w:r>
-        <w:t>author</w:t>
-      </w:r>
-      <w:proofErr w:type="gramEnd"/>
-      <w:r>
-        <w:t xml:space="preserve"> names, so do not anonymize your submission. At least one author must be listed after “Correspondence to”. ORCID links for the authors will make it easier for the readers to find </w:t>
-      </w:r>
-      <w:proofErr w:type="gramStart"/>
-      <w:r>
-        <w:t>you, but</w:t>
-      </w:r>
-      <w:proofErr w:type="gramEnd"/>
-      <w:r>
-        <w:t xml:space="preserve"> are not mandatory; to link an </w:t>
-      </w:r>
-      <w:proofErr w:type="spellStart"/>
-      <w:r>
-        <w:t>iD</w:t>
-      </w:r>
-      <w:proofErr w:type="spellEnd"/>
-      <w:r>
-        <w:t xml:space="preserve"> icon to your record, right-click it and choose Link.</w:t>
+        <w:t>The review is single-blind: the reviewers see the author names, so do not anonymize your submission. At least one author must be listed after “Correspondence to”. ORCID links for the authors will make it easier for the readers to find you, but are not mandatory; to link an iD icon to your record, right-click it and choose Link.</w:t>
       </w:r>
     </w:p>
     <w:p>
@@ -356,6 +332,9 @@
         <w:fldChar w:fldCharType="separate"/>
       </w:r>
       <w:r>
+        <w:rPr>
+          <w:noProof/>
+        </w:rPr>
         <w:t>1</w:t>
       </w:r>
       <w:r>
@@ -415,7 +394,13 @@
                       <w:rPr>
                         <w:rFonts w:ascii="Cambria Math" w:hAnsi="Cambria Math"/>
                       </w:rPr>
-                      <m:t>x→</m:t>
+                      <m:t>x</m:t>
+                    </m:r>
+                    <m:r>
+                      <w:rPr>
+                        <w:rFonts w:ascii="Cambria Math" w:hAnsi="Cambria Math"/>
+                      </w:rPr>
+                      <m:t>→</m:t>
                     </m:r>
                     <m:sSup>
                       <m:sSupPr>
@@ -470,7 +455,19 @@
                       <w:rPr>
                         <w:rFonts w:ascii="Cambria Math" w:hAnsi="Cambria Math"/>
                       </w:rPr>
-                      <m:t>x-8</m:t>
+                      <m:t>x</m:t>
+                    </m:r>
+                    <m:r>
+                      <w:rPr>
+                        <w:rFonts w:ascii="Cambria Math" w:hAnsi="Cambria Math"/>
+                      </w:rPr>
+                      <m:t>-</m:t>
+                    </m:r>
+                    <m:r>
+                      <w:rPr>
+                        <w:rFonts w:ascii="Cambria Math" w:hAnsi="Cambria Math"/>
+                      </w:rPr>
+                      <m:t>8</m:t>
                     </m:r>
                   </m:den>
                 </m:f>
@@ -532,7 +529,13 @@
                       <w:rPr>
                         <w:rFonts w:ascii="Cambria Math" w:hAnsi="Cambria Math"/>
                       </w:rPr>
-                      <m:t>x→</m:t>
+                      <m:t>x</m:t>
+                    </m:r>
+                    <m:r>
+                      <w:rPr>
+                        <w:rFonts w:ascii="Cambria Math" w:hAnsi="Cambria Math"/>
+                      </w:rPr>
+                      <m:t>→</m:t>
                     </m:r>
                     <m:sSup>
                       <m:sSupPr>
@@ -587,7 +590,19 @@
                       <w:rPr>
                         <w:rFonts w:ascii="Cambria Math" w:hAnsi="Cambria Math"/>
                       </w:rPr>
-                      <m:t>x-3</m:t>
+                      <m:t>x</m:t>
+                    </m:r>
+                    <m:r>
+                      <w:rPr>
+                        <w:rFonts w:ascii="Cambria Math" w:hAnsi="Cambria Math"/>
+                      </w:rPr>
+                      <m:t>-</m:t>
+                    </m:r>
+                    <m:r>
+                      <w:rPr>
+                        <w:rFonts w:ascii="Cambria Math" w:hAnsi="Cambria Math"/>
+                      </w:rPr>
+                      <m:t>3</m:t>
                     </m:r>
                   </m:den>
                 </m:f>
@@ -595,7 +610,13 @@
                   <w:rPr>
                     <w:rFonts w:ascii="Cambria Math" w:hAnsi="Cambria Math"/>
                   </w:rPr>
-                  <m:t>=ω</m:t>
+                  <m:t>=</m:t>
+                </m:r>
+                <m:r>
+                  <w:rPr>
+                    <w:rFonts w:ascii="Cambria Math" w:hAnsi="Cambria Math"/>
+                  </w:rPr>
+                  <m:t>ω</m:t>
                 </m:r>
               </m:e>
             </m:func>
@@ -617,6 +638,9 @@
         <w:fldChar w:fldCharType="separate"/>
       </w:r>
       <w:r>
+        <w:rPr>
+          <w:noProof/>
+        </w:rPr>
         <w:t>1</w:t>
       </w:r>
       <w:r>
@@ -647,24 +671,22 @@
           <w:id w:val="1693179937"/>
           <w:citation/>
         </w:sdtPr>
+        <w:sdtEndPr/>
         <w:sdtContent>
           <w:r>
             <w:fldChar w:fldCharType="begin"/>
           </w:r>
           <w:r>
-            <w:instrText xml:space="preserve"> CITATION AI4X_Jumper2021 \l 1033 \* MERGEFORMAT </w:instrText>
+            <w:instrText xml:space="preserve"> CITATION AI4X_Jumper2021 \l 1033  </w:instrText>
           </w:r>
           <w:r>
             <w:fldChar w:fldCharType="separate"/>
           </w:r>
           <w:r>
             <w:rPr>
-              <w:rFonts w:ascii="Times New Roman" w:hAnsi="Times New Roman"/>
-              <w:b/>
-              <w:bCs/>
               <w:noProof/>
             </w:rPr>
-            <w:t>[1]</w:t>
+            <w:t>(Jumper, et al., 2021)</w:t>
           </w:r>
           <w:r>
             <w:fldChar w:fldCharType="end"/>
@@ -679,12 +701,13 @@
           <w:id w:val="552510234"/>
           <w:citation/>
         </w:sdtPr>
+        <w:sdtEndPr/>
         <w:sdtContent>
           <w:r>
             <w:fldChar w:fldCharType="begin"/>
           </w:r>
           <w:r>
-            <w:instrText xml:space="preserve"> CITATION AI4X_Schutt2017 \m AI4X_Xie2018 \l 1033 \* MERGEFORMAT </w:instrText>
+            <w:instrText xml:space="preserve"> CITATION AI4X_Schutt2017 \m AI4X_Xie2018 \l 1033  </w:instrText>
           </w:r>
           <w:r>
             <w:fldChar w:fldCharType="separate"/>
@@ -693,7 +716,7 @@
             <w:rPr>
               <w:noProof/>
             </w:rPr>
-            <w:t>[2, 3]</w:t>
+            <w:t>(Schütt, et al., 2017; Xie &amp; Grossman, 2018)</w:t>
           </w:r>
           <w:r>
             <w:fldChar w:fldCharType="end"/>
@@ -708,12 +731,13 @@
           <w:id w:val="1960373899"/>
           <w:citation/>
         </w:sdtPr>
+        <w:sdtEndPr/>
         <w:sdtContent>
           <w:r>
             <w:fldChar w:fldCharType="begin"/>
           </w:r>
           <w:r>
-            <w:instrText xml:space="preserve"> CITATION AI4X_Merchant2023 \l 1033 \* MERGEFORMAT </w:instrText>
+            <w:instrText xml:space="preserve"> CITATION AI4X_Merchant2023 \l 1033  </w:instrText>
           </w:r>
           <w:r>
             <w:fldChar w:fldCharType="separate"/>
@@ -722,7 +746,7 @@
             <w:rPr>
               <w:noProof/>
             </w:rPr>
-            <w:t>[4]</w:t>
+            <w:t>(Merchant, et al., 2023)</w:t>
           </w:r>
           <w:r>
             <w:fldChar w:fldCharType="end"/>
@@ -737,12 +761,13 @@
           <w:id w:val="-1820031139"/>
           <w:citation/>
         </w:sdtPr>
+        <w:sdtEndPr/>
         <w:sdtContent>
           <w:r>
             <w:fldChar w:fldCharType="begin"/>
           </w:r>
           <w:r>
-            <w:instrText xml:space="preserve"> CITATION AI4X_Burger2020_Complete \l 1033 \* MERGEFORMAT \* MERGEFORMAT </w:instrText>
+            <w:instrText xml:space="preserve"> CITATION AI4X_Burger2020_Complete \l 1033   </w:instrText>
           </w:r>
           <w:r>
             <w:fldChar w:fldCharType="separate"/>
@@ -751,7 +776,7 @@
             <w:rPr>
               <w:noProof/>
             </w:rPr>
-            <w:t>[5]</w:t>
+            <w:t>(Burger, et al., 2020)</w:t>
           </w:r>
           <w:r>
             <w:fldChar w:fldCharType="end"/>
@@ -766,12 +791,13 @@
           <w:id w:val="-156459740"/>
           <w:citation/>
         </w:sdtPr>
+        <w:sdtEndPr/>
         <w:sdtContent>
           <w:r>
             <w:fldChar w:fldCharType="begin"/>
           </w:r>
           <w:r>
-            <w:instrText xml:space="preserve"> CITATION AI4X_Roadmap2025 \l 1033 \* MERGEFORMAT </w:instrText>
+            <w:instrText xml:space="preserve">CITATION AI4X_Roadmap2025 \l 1033  </w:instrText>
           </w:r>
           <w:r>
             <w:fldChar w:fldCharType="separate"/>
@@ -780,7 +806,7 @@
             <w:rPr>
               <w:noProof/>
             </w:rPr>
-            <w:t>[6]</w:t>
+            <w:t>(Dale, et al., 2025)</w:t>
           </w:r>
           <w:r>
             <w:fldChar w:fldCharType="end"/>
@@ -813,7 +839,13 @@
         <w:fldChar w:fldCharType="separate"/>
       </w:r>
       <w:r>
-        <w:t>Figure 1</w:t>
+        <w:t xml:space="preserve">Figure </w:t>
+      </w:r>
+      <w:r>
+        <w:rPr>
+          <w:noProof/>
+        </w:rPr>
+        <w:t>1</w:t>
       </w:r>
       <w:r>
         <w:fldChar w:fldCharType="end"/>
@@ -831,7 +863,13 @@
         <w:fldChar w:fldCharType="separate"/>
       </w:r>
       <w:r>
-        <w:t>Table 1</w:t>
+        <w:t xml:space="preserve">Table </w:t>
+      </w:r>
+      <w:r>
+        <w:rPr>
+          <w:noProof/>
+        </w:rPr>
+        <w:t>1</w:t>
       </w:r>
       <w:r>
         <w:fldChar w:fldCharType="end"/>
@@ -897,6 +935,9 @@
       </w:r>
       <w:fldSimple w:instr=" SEQ Figure \* ARABIC ">
         <w:r>
+          <w:rPr>
+            <w:noProof/>
+          </w:rPr>
           <w:t>1</w:t>
         </w:r>
       </w:fldSimple>
@@ -904,19 +945,9 @@
       <w:r>
         <w:t xml:space="preserve">: Collaboration was just as important to the success of the study as </w:t>
       </w:r>
-      <w:proofErr w:type="spellStart"/>
-      <w:proofErr w:type="gramStart"/>
-      <w:r>
-        <w:t>auto</w:t>
-      </w:r>
-      <w:r>
-        <w:t>.</w:t>
-      </w:r>
-      <w:r>
-        <w:t>mation</w:t>
-      </w:r>
-      <w:proofErr w:type="spellEnd"/>
-      <w:proofErr w:type="gramEnd"/>
+      <w:r>
+        <w:t>automation</w:t>
+      </w:r>
       <w:r>
         <w:t>. The illustration was generated with Google Gemini (Nano Banana), and its defects are kept on purpose</w:t>
       </w:r>
@@ -928,12 +959,13 @@
           <w:id w:val="-1691595734"/>
           <w:citation/>
         </w:sdtPr>
+        <w:sdtEndPr/>
         <w:sdtContent>
           <w:r>
             <w:fldChar w:fldCharType="begin"/>
           </w:r>
           <w:r>
-            <w:instrText xml:space="preserve"> CITATION AI4X_Committee2028 \l 1033 \* MERGEFORMAT </w:instrText>
+            <w:instrText xml:space="preserve"> CITATION AI4X_Committee2028 \l 1033  </w:instrText>
           </w:r>
           <w:r>
             <w:fldChar w:fldCharType="separate"/>
@@ -942,7 +974,7 @@
             <w:rPr>
               <w:noProof/>
             </w:rPr>
-            <w:t>[7]</w:t>
+            <w:t>(AI4X Program Committee, 2028)</w:t>
           </w:r>
           <w:r>
             <w:fldChar w:fldCharType="end"/>
@@ -965,6 +997,9 @@
       </w:r>
       <w:fldSimple w:instr=" SEQ Table \* ARABIC ">
         <w:r>
+          <w:rPr>
+            <w:noProof/>
+          </w:rPr>
           <w:t>1</w:t>
         </w:r>
       </w:fldSimple>
@@ -986,15 +1021,7 @@
         <w:t>2</w:t>
       </w:r>
       <w:r>
-        <w:t xml:space="preserve">, and inference time per structure. The best values </w:t>
-      </w:r>
-      <w:proofErr w:type="gramStart"/>
-      <w:r>
-        <w:t>are in</w:t>
-      </w:r>
-      <w:proofErr w:type="gramEnd"/>
-      <w:r>
-        <w:t xml:space="preserve"> bold; the numbers are illustrative.</w:t>
+        <w:t>, and inference time per structure. The best values are in bold; the numbers are illustrative.</w:t>
       </w:r>
     </w:p>
     <w:tbl>
@@ -1061,14 +1088,7 @@
             </w:r>
             <w:r>
               <w:br/>
-            </w:r>
-            <w:proofErr w:type="spellStart"/>
-            <w:r>
-              <w:t>meV</w:t>
-            </w:r>
-            <w:proofErr w:type="spellEnd"/>
-            <w:r>
-              <w:t>/atom</w:t>
+              <w:t>meV/atom</w:t>
             </w:r>
           </w:p>
         </w:tc>
@@ -1131,12 +1151,8 @@
             </w:r>
             <w:r>
               <w:br/>
-            </w:r>
-            <w:proofErr w:type="spellStart"/>
-            <w:r>
               <w:t>ms</w:t>
             </w:r>
-            <w:proofErr w:type="spellEnd"/>
           </w:p>
         </w:tc>
       </w:tr>
@@ -1402,15 +1418,7 @@
         <w:pStyle w:val="FirstParagraph"/>
       </w:pPr>
       <w:r>
-        <w:t>Use the styles of the template: Heading 1 and Heading 2 number the sections, Unnumbered Heading is for the acknowledgments and references. Use Appendix Heading for appendices, and Appendix Heading 2 and Appendix Heading 3 for their subsections. The numbers of the figures, tables, and equations, and the references to them, are fields: after moving things around, select all (</w:t>
-      </w:r>
-      <w:proofErr w:type="spellStart"/>
-      <w:r>
-        <w:t>Ctrl+A</w:t>
-      </w:r>
-      <w:proofErr w:type="spellEnd"/>
-      <w:r>
-        <w:t>) and press F9 to update them.</w:t>
+        <w:t>Use the styles of the template: Heading 1 and Heading 2 number the sections, Unnumbered Heading is for the acknowledgments and references. Use Appendix Heading for appendices, and Appendix Heading 2 and Appendix Heading 3 for their subsections. The numbers of the figures, tables, and equations, and the references to them, are fields: after moving things around, select all (Ctrl+A) and press F9 to update them.</w:t>
       </w:r>
     </w:p>
     <w:p>
@@ -1418,19 +1426,11 @@
         <w:pStyle w:val="BodyText"/>
       </w:pPr>
       <w:r>
-        <w:t xml:space="preserve">The template embeds its font, Source Serif 4, so it looks the same on computers that do not have the font installed. Please submit a </w:t>
-      </w:r>
-      <w:proofErr w:type="gramStart"/>
-      <w:r>
-        <w:t>PDF, and</w:t>
-      </w:r>
-      <w:proofErr w:type="gramEnd"/>
-      <w:r>
-        <w:t xml:space="preserve"> check in it that the bold and italic text and the equations look </w:t>
+        <w:t xml:space="preserve">The template embeds its font, Source Serif 4, so it looks the same on computers that do not have the font installed. Please submit a PDF, and check in it </w:t>
       </w:r>
       <w:r>
         <w:lastRenderedPageBreak/>
-        <w:t>right. Fill the title, the authors, and the keywords in File → Info → Properties: they become the PDF metadata, which improves search discoverability.</w:t>
+        <w:t>that the bold and italic text and the equations look right. Fill the title, the authors, and the keywords in File → Info → Properties: they become the PDF metadata, which improves search discoverability.</w:t>
       </w:r>
     </w:p>
     <w:p>
@@ -1455,7 +1455,13 @@
         <w:fldChar w:fldCharType="separate"/>
       </w:r>
       <w:r>
-        <w:t>Figure 1</w:t>
+        <w:t xml:space="preserve">Figure </w:t>
+      </w:r>
+      <w:r>
+        <w:rPr>
+          <w:noProof/>
+        </w:rPr>
+        <w:t>1</w:t>
       </w:r>
       <w:r>
         <w:fldChar w:fldCharType="end"/>
@@ -1468,12 +1474,13 @@
           <w:id w:val="1806423568"/>
           <w:citation/>
         </w:sdtPr>
+        <w:sdtEndPr/>
         <w:sdtContent>
           <w:r>
             <w:fldChar w:fldCharType="begin"/>
           </w:r>
           <w:r>
-            <w:instrText xml:space="preserve"> CITATION AI4X_Template2026 \l 1033 \* MERGEFORMAT </w:instrText>
+            <w:instrText xml:space="preserve"> CITATION AI4X_Template2026 \l 1033  </w:instrText>
           </w:r>
           <w:r>
             <w:fldChar w:fldCharType="separate"/>
@@ -1482,7 +1489,7 @@
             <w:rPr>
               <w:noProof/>
             </w:rPr>
-            <w:t>[8]</w:t>
+            <w:t>(Kazeev, 2026)</w:t>
           </w:r>
           <w:r>
             <w:fldChar w:fldCharType="end"/>
@@ -1505,12 +1512,13 @@
           <w:id w:val="-1428026154"/>
           <w:citation/>
         </w:sdtPr>
+        <w:sdtEndPr/>
         <w:sdtContent>
           <w:r>
             <w:fldChar w:fldCharType="begin"/>
           </w:r>
           <w:r>
-            <w:instrText xml:space="preserve"> CITATION AI4X_Committee2028 \l 1033 \* MERGEFORMAT </w:instrText>
+            <w:instrText xml:space="preserve"> CITATION AI4X_Committee2028 \l 1033  </w:instrText>
           </w:r>
           <w:r>
             <w:fldChar w:fldCharType="separate"/>
@@ -1519,7 +1527,7 @@
             <w:rPr>
               <w:noProof/>
             </w:rPr>
-            <w:t>[7]</w:t>
+            <w:t>(AI4X Program Committee, 2028)</w:t>
           </w:r>
           <w:r>
             <w:fldChar w:fldCharType="end"/>
@@ -1533,12 +1541,14 @@
         <w:r>
           <w:rPr>
             <w:rStyle w:val="Hyperlink"/>
+            <w:color w:val="4C94D8" w:themeColor="text2" w:themeTint="80"/>
+            <w:u w:val="single"/>
           </w:rPr>
           <w:t>reference-audit</w:t>
         </w:r>
       </w:hyperlink>
       <w:r>
-        <w:t xml:space="preserve"> to run the checks yourself on the PDF of your abstract.</w:t>
+        <w:t xml:space="preserve"> to run the checks yourself.</w:t>
       </w:r>
     </w:p>
     <w:p>
@@ -1561,12 +1571,13 @@
           <w:id w:val="-1371139227"/>
           <w:citation/>
         </w:sdtPr>
+        <w:sdtEndPr/>
         <w:sdtContent>
           <w:r>
             <w:fldChar w:fldCharType="begin"/>
           </w:r>
           <w:r>
-            <w:instrText xml:space="preserve"> CITATION AI4X_Template2026 \l 1033 \* MERGEFORMAT </w:instrText>
+            <w:instrText xml:space="preserve"> CITATION AI4X_Template2026 \l 1033  </w:instrText>
           </w:r>
           <w:r>
             <w:fldChar w:fldCharType="separate"/>
@@ -1575,7 +1586,7 @@
             <w:rPr>
               <w:noProof/>
             </w:rPr>
-            <w:t>[8]</w:t>
+            <w:t>(Kazeev, 2026)</w:t>
           </w:r>
           <w:r>
             <w:fldChar w:fldCharType="end"/>
@@ -1590,12 +1601,13 @@
           <w:id w:val="1213379873"/>
           <w:citation/>
         </w:sdtPr>
+        <w:sdtEndPr/>
         <w:sdtContent>
           <w:r>
             <w:fldChar w:fldCharType="begin"/>
           </w:r>
           <w:r>
-            <w:instrText xml:space="preserve"> CITATION AI4X_IAC2025 \l 1033 \* MERGEFORMAT </w:instrText>
+            <w:instrText xml:space="preserve"> CITATION AI4X_IAC2025 \l 1033  </w:instrText>
           </w:r>
           <w:r>
             <w:fldChar w:fldCharType="separate"/>
@@ -1604,7 +1616,7 @@
             <w:rPr>
               <w:noProof/>
             </w:rPr>
-            <w:t>[9]</w:t>
+            <w:t>(Woods, Grande, &amp; Farì, 2025)</w:t>
           </w:r>
           <w:r>
             <w:fldChar w:fldCharType="end"/>
@@ -1626,795 +1638,288 @@
     <w:p>
       <w:pPr>
         <w:pStyle w:val="Bibliography"/>
-        <w:spacing w:after="0" w:line="20" w:lineRule="auto"/>
-        <w:rPr>
-          <w:noProof/>
-          <w:sz w:val="2"/>
-        </w:rPr>
-      </w:pPr>
-      <w:r>
-        <w:rPr>
-          <w:sz w:val="2"/>
-        </w:rPr>
+        <w:ind w:left="720" w:hanging="720"/>
+        <w:rPr>
+          <w:noProof/>
+          <w:sz w:val="24"/>
+          <w:szCs w:val="24"/>
+        </w:rPr>
+      </w:pPr>
+      <w:r>
         <w:fldChar w:fldCharType="begin"/>
       </w:r>
       <w:r>
-        <w:rPr>
-          <w:sz w:val="2"/>
-        </w:rPr>
-        <w:instrText xml:space="preserve"> BIBLIOGRAPHY \l 1033 \* MERGEFORMAT </w:instrText>
-      </w:r>
-      <w:r>
-        <w:rPr>
-          <w:sz w:val="2"/>
-        </w:rPr>
+        <w:instrText xml:space="preserve"> BIBLIOGRAPHY \l 1033  </w:instrText>
+      </w:r>
+      <w:r>
         <w:fldChar w:fldCharType="separate"/>
       </w:r>
-    </w:p>
-    <w:tbl>
-      <w:tblPr>
-        <w:tblW w:w="4592" w:type="dxa"/>
-        <w:tblCellSpacing w:w="15" w:type="dxa"/>
-        <w:tblLayout w:type="fixed"/>
-        <w:tblCellMar>
-          <w:left w:w="0" w:type="dxa"/>
-          <w:right w:w="0" w:type="dxa"/>
-        </w:tblCellMar>
-        <w:tblLook w:val="04A0" w:firstRow="1" w:lastRow="0" w:firstColumn="1" w:lastColumn="0" w:noHBand="0" w:noVBand="1"/>
-      </w:tblPr>
-      <w:tblGrid>
-        <w:gridCol w:w="360"/>
-        <w:gridCol w:w="4232"/>
-      </w:tblGrid>
-      <w:tr>
-        <w:trPr>
-          <w:divId w:val="2024670519"/>
-          <w:tblCellSpacing w:w="15" w:type="dxa"/>
-        </w:trPr>
-        <w:tc>
-          <w:tcPr>
-            <w:tcW w:w="315" w:type="dxa"/>
-            <w:tcMar>
-              <w:top w:w="15" w:type="dxa"/>
-              <w:left w:w="15" w:type="dxa"/>
-              <w:bottom w:w="15" w:type="dxa"/>
-              <w:right w:w="15" w:type="dxa"/>
-            </w:tcMar>
-            <w:hideMark/>
-          </w:tcPr>
-          <w:p>
-            <w:pPr>
-              <w:pStyle w:val="Bibliography"/>
-              <w:suppressAutoHyphens/>
-              <w:ind w:left="0" w:firstLine="0"/>
-              <w:rPr>
-                <w:sz w:val="24"/>
-                <w:szCs w:val="24"/>
-              </w:rPr>
-            </w:pPr>
-            <w:r>
-              <w:t xml:space="preserve">[1] </w:t>
-            </w:r>
-          </w:p>
-        </w:tc>
-        <w:tc>
-          <w:tcPr>
-            <w:tcW w:w="4187" w:type="dxa"/>
-            <w:tcMar>
-              <w:top w:w="15" w:type="dxa"/>
-              <w:left w:w="15" w:type="dxa"/>
-              <w:bottom w:w="15" w:type="dxa"/>
-              <w:right w:w="15" w:type="dxa"/>
-            </w:tcMar>
-            <w:hideMark/>
-          </w:tcPr>
-          <w:p>
-            <w:pPr>
-              <w:pStyle w:val="Bibliography"/>
-              <w:suppressAutoHyphens/>
-              <w:ind w:left="0" w:firstLine="0"/>
-            </w:pPr>
-            <w:r>
-              <w:t>J. Jumper, R. Evans, A. Pritzel, T. Green,</w:t>
-            </w:r>
-            <w:r>
-              <w:rPr>
-                <w:i/>
-                <w:iCs/>
-              </w:rPr>
-              <w:t xml:space="preserve"> M.</w:t>
-            </w:r>
-            <w:r>
-              <w:t xml:space="preserve"> Figurnov, O. Ronneberger, K. </w:t>
-            </w:r>
-            <w:proofErr w:type="spellStart"/>
-            <w:r>
-              <w:t>Tunyasuvunakool</w:t>
-            </w:r>
-            <w:proofErr w:type="spellEnd"/>
-            <w:r>
-              <w:t xml:space="preserve">, R. Bates, A. Žídek, A. Potapenko, A. </w:t>
-            </w:r>
-            <w:proofErr w:type="spellStart"/>
-            <w:r>
-              <w:t>Bridgland</w:t>
-            </w:r>
-            <w:proofErr w:type="spellEnd"/>
-            <w:r>
-              <w:t xml:space="preserve">, C. Meyer, S. A. A. Kohl, A. J. Ballard, A. Cowie, B. Romera-Paredes, S. Nikolov, R. Jain, J. Adler, T. Back, S. Petersen, D. Reiman, E. Clancy, M. Zielinski, M. Steinegger, M. Pacholska, T. Berghammer, S. Bodenstein, D. Silver, O. </w:t>
-            </w:r>
-            <w:proofErr w:type="spellStart"/>
-            <w:r>
-              <w:t>Vinyals</w:t>
-            </w:r>
-            <w:proofErr w:type="spellEnd"/>
-            <w:r>
-              <w:t xml:space="preserve">, A. W. Senior, K. </w:t>
-            </w:r>
-            <w:proofErr w:type="spellStart"/>
-            <w:r>
-              <w:t>Kavukcuoglu</w:t>
-            </w:r>
-            <w:proofErr w:type="spellEnd"/>
-            <w:r>
-              <w:t xml:space="preserve">, P. Kohli and D. Hassabis, "Highly accurate protein structure prediction with AlphaFold," </w:t>
-            </w:r>
-            <w:r>
-              <w:rPr>
-                <w:i/>
-                <w:iCs/>
-              </w:rPr>
-              <w:t xml:space="preserve">Nature, </w:t>
-            </w:r>
-            <w:r>
-              <w:t>vol. 596, no. 7873, p. 583–589, 2021.</w:t>
-            </w:r>
-            <w:r>
-              <w:t xml:space="preserve"> </w:t>
-            </w:r>
-            <w:proofErr w:type="spellStart"/>
-            <w:r>
-              <w:t>doi</w:t>
-            </w:r>
-            <w:proofErr w:type="spellEnd"/>
-            <w:r>
-              <w:t>: 10.1038/s41586-021-03819-2.</w:t>
-            </w:r>
-            <w:r>
-              <w:t xml:space="preserve"> </w:t>
-            </w:r>
-          </w:p>
-        </w:tc>
-      </w:tr>
-      <w:tr>
-        <w:trPr>
-          <w:divId w:val="2024670519"/>
-          <w:tblCellSpacing w:w="15" w:type="dxa"/>
-        </w:trPr>
-        <w:tc>
-          <w:tcPr>
-            <w:tcW w:w="315" w:type="dxa"/>
-            <w:tcMar>
-              <w:top w:w="15" w:type="dxa"/>
-              <w:left w:w="15" w:type="dxa"/>
-              <w:bottom w:w="15" w:type="dxa"/>
-              <w:right w:w="15" w:type="dxa"/>
-            </w:tcMar>
-            <w:hideMark/>
-          </w:tcPr>
-          <w:p>
-            <w:pPr>
-              <w:pStyle w:val="Bibliography"/>
-              <w:suppressAutoHyphens/>
-              <w:ind w:left="0" w:firstLine="0"/>
-            </w:pPr>
-            <w:r>
-              <w:t xml:space="preserve">[2] </w:t>
-            </w:r>
-          </w:p>
-        </w:tc>
-        <w:tc>
-          <w:tcPr>
-            <w:tcW w:w="4187" w:type="dxa"/>
-            <w:tcMar>
-              <w:top w:w="15" w:type="dxa"/>
-              <w:left w:w="15" w:type="dxa"/>
-              <w:bottom w:w="15" w:type="dxa"/>
-              <w:right w:w="15" w:type="dxa"/>
-            </w:tcMar>
-            <w:hideMark/>
-          </w:tcPr>
-          <w:p>
-            <w:pPr>
-              <w:pStyle w:val="Bibliography"/>
-              <w:suppressAutoHyphens/>
-              <w:ind w:left="0" w:firstLine="0"/>
-            </w:pPr>
-            <w:r>
-              <w:t xml:space="preserve">K. Schütt, P.-J. </w:t>
-            </w:r>
-            <w:proofErr w:type="spellStart"/>
-            <w:r>
-              <w:t>Kindermans</w:t>
-            </w:r>
-            <w:proofErr w:type="spellEnd"/>
-            <w:r>
-              <w:t xml:space="preserve">, H. E. Sauceda Felix, S. </w:t>
-            </w:r>
-            <w:proofErr w:type="spellStart"/>
-            <w:r>
-              <w:t>Chmiela</w:t>
-            </w:r>
-            <w:proofErr w:type="spellEnd"/>
-            <w:r>
-              <w:t xml:space="preserve">, A. </w:t>
-            </w:r>
-            <w:proofErr w:type="spellStart"/>
-            <w:r>
-              <w:t>Tkatchenko</w:t>
-            </w:r>
-            <w:proofErr w:type="spellEnd"/>
-            <w:r>
-              <w:t xml:space="preserve"> and K.-R. Müller, "</w:t>
-            </w:r>
-            <w:proofErr w:type="spellStart"/>
-            <w:r>
-              <w:t>SchNet</w:t>
-            </w:r>
-            <w:proofErr w:type="spellEnd"/>
-            <w:r>
-              <w:t xml:space="preserve">: A continuous-filter convolutional neural network for modeling quantum interactions," in </w:t>
-            </w:r>
-            <w:r>
-              <w:rPr>
-                <w:i/>
-                <w:iCs/>
-              </w:rPr>
-              <w:t>Advances in Neural Information Processing Systems</w:t>
-            </w:r>
-            <w:r>
-              <w:t>, 2017.</w:t>
-            </w:r>
-            <w:r>
-              <w:t xml:space="preserve"> [Online]. Available: https://proceedings.neurips.cc/paper_files/paper/2017/file/303ed4c69846ab36c2904d3ba8573050-Paper.pdf.</w:t>
-            </w:r>
-            <w:r>
-              <w:t xml:space="preserve"> </w:t>
-            </w:r>
-          </w:p>
-        </w:tc>
-      </w:tr>
-      <w:tr>
-        <w:trPr>
-          <w:divId w:val="2024670519"/>
-          <w:tblCellSpacing w:w="15" w:type="dxa"/>
-        </w:trPr>
-        <w:tc>
-          <w:tcPr>
-            <w:tcW w:w="315" w:type="dxa"/>
-            <w:tcMar>
-              <w:top w:w="15" w:type="dxa"/>
-              <w:left w:w="15" w:type="dxa"/>
-              <w:bottom w:w="15" w:type="dxa"/>
-              <w:right w:w="15" w:type="dxa"/>
-            </w:tcMar>
-            <w:hideMark/>
-          </w:tcPr>
-          <w:p>
-            <w:pPr>
-              <w:pStyle w:val="Bibliography"/>
-              <w:suppressAutoHyphens/>
-              <w:ind w:left="0" w:firstLine="0"/>
-            </w:pPr>
-            <w:r>
-              <w:t xml:space="preserve">[3] </w:t>
-            </w:r>
-          </w:p>
-        </w:tc>
-        <w:tc>
-          <w:tcPr>
-            <w:tcW w:w="4187" w:type="dxa"/>
-            <w:tcMar>
-              <w:top w:w="15" w:type="dxa"/>
-              <w:left w:w="15" w:type="dxa"/>
-              <w:bottom w:w="15" w:type="dxa"/>
-              <w:right w:w="15" w:type="dxa"/>
-            </w:tcMar>
-            <w:hideMark/>
-          </w:tcPr>
-          <w:p>
-            <w:pPr>
-              <w:pStyle w:val="Bibliography"/>
-              <w:suppressAutoHyphens/>
-              <w:ind w:left="0" w:firstLine="0"/>
-            </w:pPr>
-            <w:r>
-              <w:t xml:space="preserve">T. Xie and J. C. Grossman, "Crystal graph convolutional neural networks for an accurate and interpretable prediction of material </w:t>
-            </w:r>
-            <w:r>
-              <w:t xml:space="preserve">properties," </w:t>
-            </w:r>
-            <w:r>
-              <w:rPr>
-                <w:i/>
-                <w:iCs/>
-              </w:rPr>
-              <w:t xml:space="preserve">Physical Review Letters, </w:t>
-            </w:r>
-            <w:r>
-              <w:t>vol. 120, no. 14, p. 145301, 2018.</w:t>
-            </w:r>
-            <w:r>
-              <w:t xml:space="preserve"> </w:t>
-            </w:r>
-            <w:proofErr w:type="spellStart"/>
-            <w:r>
-              <w:t>doi</w:t>
-            </w:r>
-            <w:proofErr w:type="spellEnd"/>
-            <w:r>
-              <w:t>: 10.1103/PhysRevLett.120.145301.</w:t>
-            </w:r>
-            <w:r>
-              <w:t xml:space="preserve"> </w:t>
-            </w:r>
-          </w:p>
-        </w:tc>
-      </w:tr>
-      <w:tr>
-        <w:trPr>
-          <w:divId w:val="2024670519"/>
-          <w:tblCellSpacing w:w="15" w:type="dxa"/>
-        </w:trPr>
-        <w:tc>
-          <w:tcPr>
-            <w:tcW w:w="315" w:type="dxa"/>
-            <w:tcMar>
-              <w:top w:w="15" w:type="dxa"/>
-              <w:left w:w="15" w:type="dxa"/>
-              <w:bottom w:w="15" w:type="dxa"/>
-              <w:right w:w="15" w:type="dxa"/>
-            </w:tcMar>
-            <w:hideMark/>
-          </w:tcPr>
-          <w:p>
-            <w:pPr>
-              <w:pStyle w:val="Bibliography"/>
-              <w:suppressAutoHyphens/>
-              <w:ind w:left="0" w:firstLine="0"/>
-            </w:pPr>
-            <w:r>
-              <w:t xml:space="preserve">[4] </w:t>
-            </w:r>
-          </w:p>
-        </w:tc>
-        <w:tc>
-          <w:tcPr>
-            <w:tcW w:w="4187" w:type="dxa"/>
-            <w:tcMar>
-              <w:top w:w="15" w:type="dxa"/>
-              <w:left w:w="15" w:type="dxa"/>
-              <w:bottom w:w="15" w:type="dxa"/>
-              <w:right w:w="15" w:type="dxa"/>
-            </w:tcMar>
-            <w:hideMark/>
-          </w:tcPr>
-          <w:p>
-            <w:pPr>
-              <w:pStyle w:val="Bibliography"/>
-              <w:suppressAutoHyphens/>
-              <w:ind w:left="0" w:firstLine="0"/>
-            </w:pPr>
-            <w:r>
-              <w:t xml:space="preserve">A. Merchant, S. </w:t>
-            </w:r>
-            <w:proofErr w:type="spellStart"/>
-            <w:r>
-              <w:t>Batzner</w:t>
-            </w:r>
-            <w:proofErr w:type="spellEnd"/>
-            <w:r>
-              <w:t xml:space="preserve">, S. S. Schoenholz, M. </w:t>
-            </w:r>
-            <w:proofErr w:type="spellStart"/>
-            <w:r>
-              <w:t>Aykol</w:t>
-            </w:r>
-            <w:proofErr w:type="spellEnd"/>
-            <w:r>
-              <w:t xml:space="preserve">, G. Cheon and E. D. </w:t>
-            </w:r>
-            <w:proofErr w:type="spellStart"/>
-            <w:r>
-              <w:t>Cubuk</w:t>
-            </w:r>
-            <w:proofErr w:type="spellEnd"/>
-            <w:r>
-              <w:t xml:space="preserve">, "Scaling deep learning for materials discovery," </w:t>
-            </w:r>
-            <w:r>
-              <w:rPr>
-                <w:i/>
-                <w:iCs/>
-              </w:rPr>
-              <w:t xml:space="preserve">Nature, </w:t>
-            </w:r>
-            <w:r>
-              <w:t>vol. 624, no. 7990, p. 80–85, 2023.</w:t>
-            </w:r>
-            <w:r>
-              <w:t xml:space="preserve"> </w:t>
-            </w:r>
-            <w:proofErr w:type="spellStart"/>
-            <w:r>
-              <w:t>doi</w:t>
-            </w:r>
-            <w:proofErr w:type="spellEnd"/>
-            <w:r>
-              <w:t>: 10.1038/s41586-023-06735-9.</w:t>
-            </w:r>
-            <w:r>
-              <w:t xml:space="preserve"> </w:t>
-            </w:r>
-          </w:p>
-        </w:tc>
-      </w:tr>
-      <w:tr>
-        <w:trPr>
-          <w:divId w:val="2024670519"/>
-          <w:tblCellSpacing w:w="15" w:type="dxa"/>
-        </w:trPr>
-        <w:tc>
-          <w:tcPr>
-            <w:tcW w:w="315" w:type="dxa"/>
-            <w:tcMar>
-              <w:top w:w="15" w:type="dxa"/>
-              <w:left w:w="15" w:type="dxa"/>
-              <w:bottom w:w="15" w:type="dxa"/>
-              <w:right w:w="15" w:type="dxa"/>
-            </w:tcMar>
-            <w:hideMark/>
-          </w:tcPr>
-          <w:p>
-            <w:pPr>
-              <w:pStyle w:val="Bibliography"/>
-              <w:suppressAutoHyphens/>
-              <w:ind w:left="0" w:firstLine="0"/>
-            </w:pPr>
-            <w:r>
-              <w:t xml:space="preserve">[5] </w:t>
-            </w:r>
-          </w:p>
-        </w:tc>
-        <w:tc>
-          <w:tcPr>
-            <w:tcW w:w="4187" w:type="dxa"/>
-            <w:tcMar>
-              <w:top w:w="15" w:type="dxa"/>
-              <w:left w:w="15" w:type="dxa"/>
-              <w:bottom w:w="15" w:type="dxa"/>
-              <w:right w:w="15" w:type="dxa"/>
-            </w:tcMar>
-            <w:hideMark/>
-          </w:tcPr>
-          <w:p>
-            <w:pPr>
-              <w:pStyle w:val="Bibliography"/>
-              <w:suppressAutoHyphens/>
-              <w:ind w:left="0" w:firstLine="0"/>
-            </w:pPr>
-            <w:r>
-              <w:t>B. Burger, P. M. Maffettone, V.</w:t>
-            </w:r>
-            <w:r>
-              <w:rPr>
-                <w:i/>
-                <w:iCs/>
-              </w:rPr>
-              <w:t xml:space="preserve"> V.</w:t>
-            </w:r>
-            <w:r>
-              <w:t xml:space="preserve"> Gusev, C. M. Aitchison, Y. Bai, X. Wang, X. Li, B. M. Alston, B. Li, R. Clowes, N. Rankin, B. Harris, R. S. Sprick and A. I. Cooper, "A mobile robotic chemist," </w:t>
-            </w:r>
-            <w:r>
-              <w:rPr>
-                <w:i/>
-                <w:iCs/>
-              </w:rPr>
-              <w:t xml:space="preserve">Nature, </w:t>
-            </w:r>
-            <w:r>
-              <w:t>vol. 583, no. 7815, p. 237–241, 2020.</w:t>
-            </w:r>
-            <w:r>
-              <w:t xml:space="preserve"> </w:t>
-            </w:r>
-            <w:proofErr w:type="spellStart"/>
-            <w:r>
-              <w:t>doi</w:t>
-            </w:r>
-            <w:proofErr w:type="spellEnd"/>
-            <w:r>
-              <w:t>: 10.1038/s41586-020-2442-2.</w:t>
-            </w:r>
-            <w:r>
-              <w:t xml:space="preserve"> </w:t>
-            </w:r>
-          </w:p>
-        </w:tc>
-      </w:tr>
-      <w:tr>
-        <w:trPr>
-          <w:divId w:val="2024670519"/>
-          <w:tblCellSpacing w:w="15" w:type="dxa"/>
-        </w:trPr>
-        <w:tc>
-          <w:tcPr>
-            <w:tcW w:w="315" w:type="dxa"/>
-            <w:tcMar>
-              <w:top w:w="15" w:type="dxa"/>
-              <w:left w:w="15" w:type="dxa"/>
-              <w:bottom w:w="15" w:type="dxa"/>
-              <w:right w:w="15" w:type="dxa"/>
-            </w:tcMar>
-            <w:hideMark/>
-          </w:tcPr>
-          <w:p>
-            <w:pPr>
-              <w:pStyle w:val="Bibliography"/>
-              <w:suppressAutoHyphens/>
-              <w:ind w:left="0" w:firstLine="0"/>
-            </w:pPr>
-            <w:r>
-              <w:t xml:space="preserve">[6] </w:t>
-            </w:r>
-          </w:p>
-        </w:tc>
-        <w:tc>
-          <w:tcPr>
-            <w:tcW w:w="4187" w:type="dxa"/>
-            <w:tcMar>
-              <w:top w:w="15" w:type="dxa"/>
-              <w:left w:w="15" w:type="dxa"/>
-              <w:bottom w:w="15" w:type="dxa"/>
-              <w:right w:w="15" w:type="dxa"/>
-            </w:tcMar>
-            <w:hideMark/>
-          </w:tcPr>
-          <w:p>
-            <w:pPr>
-              <w:pStyle w:val="Bibliography"/>
-              <w:suppressAutoHyphens/>
-              <w:ind w:left="0" w:firstLine="0"/>
-            </w:pPr>
-            <w:r>
-              <w:t xml:space="preserve">S. G. Dale, N. Kazeev, A. J. A. Price, V. Posligua, S. Roche, O. A. von Lilienfeld, K. S. Novoselov, X. Bresson, G. Mengaldo, X. Chen, T. J. O’Kane, E. R. Lines, M. J. Allen, A. E. Debus, C. Miller, J. Zhou, H. H. Dodge, D. Rousseau, A. Ustyuzhanin, Z. Yan, M. Lanza, F. Sciarrino, R. Yoshida, Z. Leong, T. L. Tan, Q. Li, A. </w:t>
-            </w:r>
-            <w:proofErr w:type="spellStart"/>
-            <w:r>
-              <w:t>Kabylda</w:t>
-            </w:r>
-            <w:proofErr w:type="spellEnd"/>
-            <w:r>
-              <w:t xml:space="preserve">, I. Poltavsky, A. Tkatchenko, S. A. Tawfik, P. D. Kamath, T. J. </w:t>
-            </w:r>
-            <w:proofErr w:type="spellStart"/>
-            <w:r>
-              <w:t>Inizan</w:t>
-            </w:r>
-            <w:proofErr w:type="spellEnd"/>
-            <w:r>
-              <w:t xml:space="preserve">, K. A. Persson, B. Y. Li, V. Karan, C. Duan, H. Jia, Q. Zhao, H. Hayashi, A. Seko, I. Tanaka, O. M. Yaghi, T. Gould, B. Chan, S. Vuckovic, T. Li, M. Lin, Z. Tang, Y. Li, Y. Xu, A. Joshi, X. Wang, L. W. T. Ng, S. V. Kalinin, M. Ahmadi, J. Zhang, S. Zhang, A. Lapkin, M. Xiao, Z. Wu, K. </w:t>
-            </w:r>
-            <w:proofErr w:type="spellStart"/>
-            <w:r>
-              <w:t>Hippalgaonkar</w:t>
-            </w:r>
-            <w:proofErr w:type="spellEnd"/>
-            <w:r>
-              <w:t xml:space="preserve">, L. Wong, L. </w:t>
-            </w:r>
-            <w:proofErr w:type="spellStart"/>
-            <w:r>
-              <w:t>Bastonero</w:t>
-            </w:r>
-            <w:proofErr w:type="spellEnd"/>
-            <w:r>
-              <w:t>, N. Marzari, D. L. Esteras Cordoba, A. Tomut, A. Quinones Andrade and J.-H. Garcia, "Ai4x roadmap: Artificial intelligence for the advancement of scientific pursuit and its future directions," 2025.</w:t>
-            </w:r>
-            <w:r>
-              <w:t xml:space="preserve"> [Online]. Available: https://arxiv.org/abs/2511.20976.</w:t>
-            </w:r>
-          </w:p>
-        </w:tc>
-      </w:tr>
-      <w:tr>
-        <w:trPr>
-          <w:divId w:val="2024670519"/>
-          <w:tblCellSpacing w:w="15" w:type="dxa"/>
-        </w:trPr>
-        <w:tc>
-          <w:tcPr>
-            <w:tcW w:w="315" w:type="dxa"/>
-            <w:tcMar>
-              <w:top w:w="15" w:type="dxa"/>
-              <w:left w:w="15" w:type="dxa"/>
-              <w:bottom w:w="15" w:type="dxa"/>
-              <w:right w:w="15" w:type="dxa"/>
-            </w:tcMar>
-            <w:hideMark/>
-          </w:tcPr>
-          <w:p>
-            <w:pPr>
-              <w:pStyle w:val="Bibliography"/>
-              <w:suppressAutoHyphens/>
-              <w:ind w:left="0" w:firstLine="0"/>
-            </w:pPr>
-            <w:r>
-              <w:t xml:space="preserve">[7] </w:t>
-            </w:r>
-          </w:p>
-        </w:tc>
-        <w:tc>
-          <w:tcPr>
-            <w:tcW w:w="4187" w:type="dxa"/>
-            <w:tcMar>
-              <w:top w:w="15" w:type="dxa"/>
-              <w:left w:w="15" w:type="dxa"/>
-              <w:bottom w:w="15" w:type="dxa"/>
-              <w:right w:w="15" w:type="dxa"/>
-            </w:tcMar>
-            <w:hideMark/>
-          </w:tcPr>
-          <w:p>
-            <w:pPr>
-              <w:pStyle w:val="Bibliography"/>
-              <w:suppressAutoHyphens/>
-              <w:ind w:left="0" w:firstLine="0"/>
-            </w:pPr>
-            <w:r>
-              <w:t xml:space="preserve">AI4X Program Committee, "Hallucinated citations and Desk Rejections – is there a </w:t>
-            </w:r>
-            <w:proofErr w:type="gramStart"/>
-            <w:r>
-              <w:t>connection?,</w:t>
-            </w:r>
-            <w:proofErr w:type="gramEnd"/>
-            <w:r>
-              <w:t xml:space="preserve">" Nature, 2028. </w:t>
-            </w:r>
-          </w:p>
-        </w:tc>
-      </w:tr>
-      <w:tr>
-        <w:trPr>
-          <w:divId w:val="2024670519"/>
-          <w:tblCellSpacing w:w="15" w:type="dxa"/>
-        </w:trPr>
-        <w:tc>
-          <w:tcPr>
-            <w:tcW w:w="315" w:type="dxa"/>
-            <w:tcMar>
-              <w:top w:w="15" w:type="dxa"/>
-              <w:left w:w="15" w:type="dxa"/>
-              <w:bottom w:w="15" w:type="dxa"/>
-              <w:right w:w="15" w:type="dxa"/>
-            </w:tcMar>
-            <w:hideMark/>
-          </w:tcPr>
-          <w:p>
-            <w:pPr>
-              <w:pStyle w:val="Bibliography"/>
-              <w:suppressAutoHyphens/>
-              <w:ind w:left="0" w:firstLine="0"/>
-            </w:pPr>
-            <w:r>
-              <w:t xml:space="preserve">[8] </w:t>
-            </w:r>
-          </w:p>
-        </w:tc>
-        <w:tc>
-          <w:tcPr>
-            <w:tcW w:w="4187" w:type="dxa"/>
-            <w:tcMar>
-              <w:top w:w="15" w:type="dxa"/>
-              <w:left w:w="15" w:type="dxa"/>
-              <w:bottom w:w="15" w:type="dxa"/>
-              <w:right w:w="15" w:type="dxa"/>
-            </w:tcMar>
-            <w:hideMark/>
-          </w:tcPr>
-          <w:p>
-            <w:pPr>
-              <w:pStyle w:val="Bibliography"/>
-              <w:suppressAutoHyphens/>
-              <w:ind w:left="0" w:firstLine="0"/>
-            </w:pPr>
-            <w:r>
-              <w:t>N. Kazeev, "AI4X Conference 2027 abstract template," 2026. [Online]. Available: https:</w:t>
-            </w:r>
-            <w:r>
-              <w:rPr>
-                <w:i/>
-                <w:iCs/>
-              </w:rPr>
-              <w:t>//github</w:t>
-            </w:r>
-            <w:r>
-              <w:t>.com/kazeevn/AI4X-Abstract-Template.</w:t>
-            </w:r>
-          </w:p>
-        </w:tc>
-      </w:tr>
-      <w:tr>
-        <w:trPr>
-          <w:divId w:val="2024670519"/>
-          <w:tblCellSpacing w:w="15" w:type="dxa"/>
-        </w:trPr>
-        <w:tc>
-          <w:tcPr>
-            <w:tcW w:w="315" w:type="dxa"/>
-            <w:tcMar>
-              <w:top w:w="15" w:type="dxa"/>
-              <w:left w:w="15" w:type="dxa"/>
-              <w:bottom w:w="15" w:type="dxa"/>
-              <w:right w:w="15" w:type="dxa"/>
-            </w:tcMar>
-            <w:hideMark/>
-          </w:tcPr>
-          <w:p>
-            <w:pPr>
-              <w:pStyle w:val="Bibliography"/>
-              <w:suppressAutoHyphens/>
-              <w:ind w:left="0" w:firstLine="0"/>
-            </w:pPr>
-            <w:r>
-              <w:t xml:space="preserve">[9] </w:t>
-            </w:r>
-          </w:p>
-        </w:tc>
-        <w:tc>
-          <w:tcPr>
-            <w:tcW w:w="4187" w:type="dxa"/>
-            <w:tcMar>
-              <w:top w:w="15" w:type="dxa"/>
-              <w:left w:w="15" w:type="dxa"/>
-              <w:bottom w:w="15" w:type="dxa"/>
-              <w:right w:w="15" w:type="dxa"/>
-            </w:tcMar>
-            <w:hideMark/>
-          </w:tcPr>
-          <w:p>
-            <w:pPr>
-              <w:pStyle w:val="Bibliography"/>
-              <w:suppressAutoHyphens/>
-              <w:ind w:left="0" w:firstLine="0"/>
-            </w:pPr>
-            <w:r>
-              <w:t xml:space="preserve">J. O. Woods, D. Grande and S. </w:t>
-            </w:r>
-            <w:proofErr w:type="spellStart"/>
-            <w:r>
-              <w:t>Farì</w:t>
-            </w:r>
-            <w:proofErr w:type="spellEnd"/>
-            <w:r>
-              <w:t>, "International Astronautical Congress LaTeX template," 2025. [Online]. Available: https://github.com/grande-dev/International-Astronautical-Congress-LaTeX-template.</w:t>
-            </w:r>
-          </w:p>
-        </w:tc>
-      </w:tr>
-    </w:tbl>
-    <w:p>
-      <w:pPr>
-        <w:spacing w:line="20" w:lineRule="auto"/>
-        <w:divId w:val="2024670519"/>
-        <w:rPr>
-          <w:rFonts w:eastAsia="Times New Roman"/>
-          <w:noProof/>
-          <w:sz w:val="2"/>
-        </w:rPr>
-      </w:pPr>
+      <w:r>
+        <w:rPr>
+          <w:noProof/>
+        </w:rPr>
+        <w:t xml:space="preserve">AI4X Program Committee. (2028). Hallucinated citations and Desk Rejections – is there a connection? </w:t>
+      </w:r>
+      <w:r>
+        <w:rPr>
+          <w:i/>
+          <w:iCs/>
+          <w:noProof/>
+        </w:rPr>
+        <w:t>Nature</w:t>
+      </w:r>
+      <w:r>
+        <w:rPr>
+          <w:noProof/>
+        </w:rPr>
+        <w:t>.</w:t>
+      </w:r>
+    </w:p>
+    <w:p>
+      <w:pPr>
+        <w:pStyle w:val="Bibliography"/>
+        <w:ind w:left="720" w:hanging="720"/>
+        <w:rPr>
+          <w:noProof/>
+        </w:rPr>
+      </w:pPr>
+      <w:r>
+        <w:rPr>
+          <w:noProof/>
+        </w:rPr>
+        <w:t xml:space="preserve">Burger, B., Maffettone, P. M., Gusev, V. V., Aitchison, C. M., Bai, Y., Wang, X., . . . Cooper, A. I. (2020). A mobile robotic chemist. </w:t>
+      </w:r>
+      <w:r>
+        <w:rPr>
+          <w:i/>
+          <w:iCs/>
+          <w:noProof/>
+        </w:rPr>
+        <w:t>Nature, 583</w:t>
+      </w:r>
+      <w:r>
+        <w:rPr>
+          <w:noProof/>
+        </w:rPr>
+        <w:t>(7815), 237–241. doi:10.1038/s41586-020-2442-2</w:t>
+      </w:r>
+    </w:p>
+    <w:p>
+      <w:pPr>
+        <w:pStyle w:val="Bibliography"/>
+        <w:ind w:left="720" w:hanging="720"/>
+        <w:rPr>
+          <w:noProof/>
+        </w:rPr>
+      </w:pPr>
+      <w:r>
+        <w:rPr>
+          <w:noProof/>
+        </w:rPr>
+        <w:t xml:space="preserve">Dale, S. G., Kazeev, N., Price, A. J., Posligua, V., Roche, S., von Lilienfeld, O. A., . . . Garcia, J.-H. (2025). </w:t>
+      </w:r>
+      <w:r>
+        <w:rPr>
+          <w:i/>
+          <w:iCs/>
+          <w:noProof/>
+        </w:rPr>
+        <w:t>AI4X roadmap: Artificial intelligence for the advancement of scientific pursuit and its future directions.</w:t>
+      </w:r>
+      <w:r>
+        <w:rPr>
+          <w:noProof/>
+        </w:rPr>
+        <w:t xml:space="preserve"> Retrieved from https://arxiv.org/abs/2511.20976</w:t>
+      </w:r>
+    </w:p>
+    <w:p>
+      <w:pPr>
+        <w:pStyle w:val="Bibliography"/>
+        <w:ind w:left="720" w:hanging="720"/>
+        <w:rPr>
+          <w:noProof/>
+        </w:rPr>
+      </w:pPr>
+      <w:r>
+        <w:rPr>
+          <w:noProof/>
+        </w:rPr>
+        <w:t xml:space="preserve">Jumper, J., Evans, R., Pritzel, A., Green, T., Figurnov, M., Ronneberger, O., . . . Hassabis, D. (2021). Highly accurate protein structure prediction with AlphaFold. </w:t>
+      </w:r>
+      <w:r>
+        <w:rPr>
+          <w:i/>
+          <w:iCs/>
+          <w:noProof/>
+        </w:rPr>
+        <w:t>Nature, 596</w:t>
+      </w:r>
+      <w:r>
+        <w:rPr>
+          <w:noProof/>
+        </w:rPr>
+        <w:t>(7873), 583–589. doi:10.1038/s41586-021-03819-2</w:t>
+      </w:r>
+    </w:p>
+    <w:p>
+      <w:pPr>
+        <w:pStyle w:val="Bibliography"/>
+        <w:ind w:left="720" w:hanging="720"/>
+        <w:rPr>
+          <w:noProof/>
+        </w:rPr>
+      </w:pPr>
+      <w:r>
+        <w:rPr>
+          <w:noProof/>
+        </w:rPr>
+        <w:t xml:space="preserve">Kazeev, N. (2026). </w:t>
+      </w:r>
+      <w:r>
+        <w:rPr>
+          <w:i/>
+          <w:iCs/>
+          <w:noProof/>
+        </w:rPr>
+        <w:t>AI4X Conference 2027 abstract template.</w:t>
+      </w:r>
+      <w:r>
+        <w:rPr>
+          <w:noProof/>
+        </w:rPr>
+        <w:t xml:space="preserve"> Retrieved from https://github.com/kazeevn/AI4X-Abstract-Template</w:t>
+      </w:r>
+    </w:p>
+    <w:p>
+      <w:pPr>
+        <w:pStyle w:val="Bibliography"/>
+        <w:ind w:left="720" w:hanging="720"/>
+        <w:rPr>
+          <w:noProof/>
+        </w:rPr>
+      </w:pPr>
+      <w:r>
+        <w:rPr>
+          <w:noProof/>
+        </w:rPr>
+        <w:t xml:space="preserve">Merchant, A., Batzner, S., Schoenholz, S. S., Aykol, M., Cheon, G., &amp; Cubuk, E. D. (2023). Scaling deep learning for materials discovery. </w:t>
+      </w:r>
+      <w:r>
+        <w:rPr>
+          <w:i/>
+          <w:iCs/>
+          <w:noProof/>
+        </w:rPr>
+        <w:t>Nature, 624</w:t>
+      </w:r>
+      <w:r>
+        <w:rPr>
+          <w:noProof/>
+        </w:rPr>
+        <w:t>(7990), 80–85. doi:10.1038/s41586-023-06735-9</w:t>
+      </w:r>
+    </w:p>
+    <w:p>
+      <w:pPr>
+        <w:pStyle w:val="Bibliography"/>
+        <w:ind w:left="720" w:hanging="720"/>
+        <w:rPr>
+          <w:noProof/>
+        </w:rPr>
+      </w:pPr>
+      <w:r>
+        <w:rPr>
+          <w:noProof/>
+        </w:rPr>
+        <w:t xml:space="preserve">Schütt, K., Kindermans, P.-J., Sauceda Felix, H. E., Chmiela, S., Tkatchenko, A., &amp; Müller, K.-R. (2017). SchNet: A continuous-filter convolutional neural network for modeling quantum interactions. </w:t>
+      </w:r>
+      <w:r>
+        <w:rPr>
+          <w:i/>
+          <w:iCs/>
+          <w:noProof/>
+        </w:rPr>
+        <w:t>Advances in Neural Information Processing Systems.</w:t>
+      </w:r>
+      <w:r>
+        <w:rPr>
+          <w:noProof/>
+        </w:rPr>
+        <w:t xml:space="preserve"> </w:t>
+      </w:r>
+      <w:r>
+        <w:rPr>
+          <w:i/>
+          <w:iCs/>
+          <w:noProof/>
+        </w:rPr>
+        <w:t>30.</w:t>
+      </w:r>
+      <w:r>
+        <w:rPr>
+          <w:noProof/>
+        </w:rPr>
+        <w:t xml:space="preserve"> Curran Associates, Inc. Retrieved from https://proceedings.neurips.cc/paper_files/paper/2017/file/303ed4c69846ab36c2904d3ba8573050-Paper.pdf</w:t>
+      </w:r>
+    </w:p>
+    <w:p>
+      <w:pPr>
+        <w:pStyle w:val="Bibliography"/>
+        <w:ind w:left="720" w:hanging="720"/>
+        <w:rPr>
+          <w:noProof/>
+        </w:rPr>
+      </w:pPr>
+      <w:r>
+        <w:rPr>
+          <w:noProof/>
+        </w:rPr>
+        <w:t xml:space="preserve">Woods, J. O., Grande, D., &amp; Farì, S. (2025). </w:t>
+      </w:r>
+      <w:r>
+        <w:rPr>
+          <w:i/>
+          <w:iCs/>
+          <w:noProof/>
+        </w:rPr>
+        <w:t>International Astronautical Congress LaTeX template.</w:t>
+      </w:r>
+      <w:r>
+        <w:rPr>
+          <w:noProof/>
+        </w:rPr>
+        <w:t xml:space="preserve"> Retrieved from https://github.com/grande-dev/International-Astronautical-Congress-LaTeX-template</w:t>
+      </w:r>
+    </w:p>
+    <w:p>
+      <w:pPr>
+        <w:pStyle w:val="Bibliography"/>
+        <w:ind w:left="720" w:hanging="720"/>
+        <w:rPr>
+          <w:noProof/>
+        </w:rPr>
+      </w:pPr>
+      <w:r>
+        <w:rPr>
+          <w:noProof/>
+        </w:rPr>
+        <w:t xml:space="preserve">Xie, T., &amp; Grossman, J. C. (2018). Crystal graph convolutional neural networks for an accurate and interpretable prediction of material properties. </w:t>
+      </w:r>
+      <w:r>
+        <w:rPr>
+          <w:i/>
+          <w:iCs/>
+          <w:noProof/>
+        </w:rPr>
+        <w:t>Physical Review Letters, 120</w:t>
+      </w:r>
+      <w:r>
+        <w:rPr>
+          <w:noProof/>
+        </w:rPr>
+        <w:t>(14), 145301. doi:10.1103/PhysRevLett.120.145301</w:t>
+      </w:r>
     </w:p>
     <w:p>
       <w:pPr>
@@ -3792,30 +3297,8 @@
 </a:theme>
 </file>
 
-<file path=word/webextensions/taskpanes.xml><?xml version="1.0" encoding="utf-8"?>
-<wetp:taskpanes xmlns:wetp="http://schemas.microsoft.com/office/webextensions/taskpanes/2010/11">
-  <wetp:taskpane dockstate="right" visibility="0" width="900" row="0">
-    <wetp:webextensionref xmlns:r="http://schemas.openxmlformats.org/officeDocument/2006/relationships" r:id="rId1"/>
-  </wetp:taskpane>
-</wetp:taskpanes>
-</file>
-
-<file path=word/webextensions/webextension1.xml><?xml version="1.0" encoding="utf-8"?>
-<we:webextension xmlns:we="http://schemas.microsoft.com/office/webextensions/webextension/2010/11" id="{223A97BB-DE75-4AEE-B1B7-1EC06FB427CE}">
-  <we:reference id="cba9fc06-6fc9-492e-9525-923870a3b909" version="2.0.0.1" store="EXCatalog" storeType="EXCatalog"/>
-  <we:alternateReferences>
-    <we:reference id="WA200010215" version="2.0.0.1" store="en-US" storeType="OMEX"/>
-  </we:alternateReferences>
-  <we:properties>
-    <we:property name="bps.codex_control.document_id" value="&quot;55eb142b-024f-4d29-8011-eb0461edc021&quot;"/>
-  </we:properties>
-  <we:bindings/>
-  <we:snapshot xmlns:r="http://schemas.openxmlformats.org/officeDocument/2006/relationships"/>
-</we:webextension>
-</file>
-
 <file path=customXml/item1.xml><?xml version="1.0" encoding="utf-8"?>
-<b:Sources xmlns:b="http://schemas.openxmlformats.org/officeDocument/2006/bibliography" xmlns="http://schemas.openxmlformats.org/officeDocument/2006/bibliography" SelectedStyle="\IEEE2006OfficeOnline.xsl" StyleName="IEEE" Version="2006">
+<b:Sources xmlns:b="http://schemas.openxmlformats.org/officeDocument/2006/bibliography" xmlns="http://schemas.openxmlformats.org/officeDocument/2006/bibliography" SelectedStyle="\APASixthEditionOfficeOnline.xsl" StyleName="APA" Version="6">
   <b:Source>
     <b:Tag>AI4X_Schutt2017</b:Tag>
     <b:SourceType>ConferenceProceedings</b:SourceType>
@@ -3939,312 +3422,6 @@
     <b:RefOrder>4</b:RefOrder>
   </b:Source>
   <b:Source>
-    <b:Tag>AI4X_Roadmap2025</b:Tag>
-    <b:SourceType>Report</b:SourceType>
-    <b:Author>
-      <b:Author>
-        <b:NameList>
-          <b:Person>
-            <b:Last>Dale</b:Last>
-            <b:First>Stephen</b:First>
-            <b:Middle>G.</b:Middle>
-          </b:Person>
-          <b:Person>
-            <b:Last>Kazeev</b:Last>
-            <b:First>Nikita</b:First>
-          </b:Person>
-          <b:Person>
-            <b:Last>Price</b:Last>
-            <b:First>Alastair</b:First>
-            <b:Middle>J. A.</b:Middle>
-          </b:Person>
-          <b:Person>
-            <b:Last>Posligua</b:Last>
-            <b:First>Victor</b:First>
-          </b:Person>
-          <b:Person>
-            <b:Last>Roche</b:Last>
-            <b:First>Stephan</b:First>
-          </b:Person>
-          <b:Person>
-            <b:Last>von Lilienfeld</b:Last>
-            <b:First>O.</b:First>
-            <b:Middle>Anatole</b:Middle>
-          </b:Person>
-          <b:Person>
-            <b:Last>Novoselov</b:Last>
-            <b:First>Konstantin</b:First>
-            <b:Middle>S.</b:Middle>
-          </b:Person>
-          <b:Person>
-            <b:Last>Bresson</b:Last>
-            <b:First>Xavier</b:First>
-          </b:Person>
-          <b:Person>
-            <b:Last>Mengaldo</b:Last>
-            <b:First>Gianmarco</b:First>
-          </b:Person>
-          <b:Person>
-            <b:Last>Chen</b:Last>
-            <b:First>Xudong</b:First>
-          </b:Person>
-          <b:Person>
-            <b:Last>O’Kane</b:Last>
-            <b:First>Terence</b:First>
-            <b:Middle>J.</b:Middle>
-          </b:Person>
-          <b:Person>
-            <b:Last>Lines</b:Last>
-            <b:First>Emily</b:First>
-            <b:Middle>R.</b:Middle>
-          </b:Person>
-          <b:Person>
-            <b:Last>Allen</b:Last>
-            <b:First>Matthew</b:First>
-            <b:Middle>J.</b:Middle>
-          </b:Person>
-          <b:Person>
-            <b:Last>Debus</b:Last>
-            <b:First>Amandine</b:First>
-            <b:Middle>E.</b:Middle>
-          </b:Person>
-          <b:Person>
-            <b:Last>Miller</b:Last>
-            <b:First>Clayton</b:First>
-          </b:Person>
-          <b:Person>
-            <b:Last>Zhou</b:Last>
-            <b:First>Jiayu</b:First>
-          </b:Person>
-          <b:Person>
-            <b:Last>Dodge</b:Last>
-            <b:First>Hiroko</b:First>
-            <b:Middle>H.</b:Middle>
-          </b:Person>
-          <b:Person>
-            <b:Last>Rousseau</b:Last>
-            <b:First>David</b:First>
-          </b:Person>
-          <b:Person>
-            <b:Last>Ustyuzhanin</b:Last>
-            <b:First>Andrey</b:First>
-          </b:Person>
-          <b:Person>
-            <b:Last>Yan</b:Last>
-            <b:First>Ziyun</b:First>
-          </b:Person>
-          <b:Person>
-            <b:Last>Lanza</b:Last>
-            <b:First>Mario</b:First>
-          </b:Person>
-          <b:Person>
-            <b:Last>Sciarrino</b:Last>
-            <b:First>Fabio</b:First>
-          </b:Person>
-          <b:Person>
-            <b:Last>Yoshida</b:Last>
-            <b:First>Ryo</b:First>
-          </b:Person>
-          <b:Person>
-            <b:Last>Leong</b:Last>
-            <b:First>Zhidong</b:First>
-          </b:Person>
-          <b:Person>
-            <b:Last>Tan</b:Last>
-            <b:First>Teck</b:First>
-            <b:Middle>Leong</b:Middle>
-          </b:Person>
-          <b:Person>
-            <b:Last>Li</b:Last>
-            <b:First>Qianxiao</b:First>
-          </b:Person>
-          <b:Person>
-            <b:Last>Kabylda</b:Last>
-            <b:First>Adil</b:First>
-          </b:Person>
-          <b:Person>
-            <b:Last>Poltavsky</b:Last>
-            <b:First>Igor</b:First>
-          </b:Person>
-          <b:Person>
-            <b:Last>Tkatchenko</b:Last>
-            <b:First>Alexandre</b:First>
-          </b:Person>
-          <b:Person>
-            <b:Last>Tawfik</b:Last>
-            <b:First>Sherif</b:First>
-            <b:Middle>Abdulkader</b:Middle>
-          </b:Person>
-          <b:Person>
-            <b:Last>Kamath</b:Last>
-            <b:First>Prathami</b:First>
-            <b:Middle>Divakar</b:Middle>
-          </b:Person>
-          <b:Person>
-            <b:Last>Inizan</b:Last>
-            <b:First>Theo</b:First>
-            <b:Middle>Jaffrelot</b:Middle>
-          </b:Person>
-          <b:Person>
-            <b:Last>Persson</b:Last>
-            <b:First>Kristin</b:First>
-            <b:Middle>A.</b:Middle>
-          </b:Person>
-          <b:Person>
-            <b:Last>Li</b:Last>
-            <b:First>Bryant</b:First>
-            <b:Middle>Y.</b:Middle>
-          </b:Person>
-          <b:Person>
-            <b:Last>Karan</b:Last>
-            <b:First>Vir</b:First>
-          </b:Person>
-          <b:Person>
-            <b:Last>Duan</b:Last>
-            <b:First>Chenru</b:First>
-          </b:Person>
-          <b:Person>
-            <b:Last>Jia</b:Last>
-            <b:First>Haojun</b:First>
-          </b:Person>
-          <b:Person>
-            <b:Last>Zhao</b:Last>
-            <b:First>Qiyuan</b:First>
-          </b:Person>
-          <b:Person>
-            <b:Last>Hayashi</b:Last>
-            <b:First>Hiroyuki</b:First>
-          </b:Person>
-          <b:Person>
-            <b:Last>Seko</b:Last>
-            <b:First>Atsuto</b:First>
-          </b:Person>
-          <b:Person>
-            <b:Last>Tanaka</b:Last>
-            <b:First>Isao</b:First>
-          </b:Person>
-          <b:Person>
-            <b:Last>Yaghi</b:Last>
-            <b:First>Omar</b:First>
-            <b:Middle>M.</b:Middle>
-          </b:Person>
-          <b:Person>
-            <b:Last>Gould</b:Last>
-            <b:First>Tim</b:First>
-          </b:Person>
-          <b:Person>
-            <b:Last>Chan</b:Last>
-            <b:First>Bun</b:First>
-          </b:Person>
-          <b:Person>
-            <b:Last>Vuckovic</b:Last>
-            <b:First>Stefan</b:First>
-          </b:Person>
-          <b:Person>
-            <b:Last>Li</b:Last>
-            <b:First>Tianbo</b:First>
-          </b:Person>
-          <b:Person>
-            <b:Last>Lin</b:Last>
-            <b:First>Min</b:First>
-          </b:Person>
-          <b:Person>
-            <b:Last>Tang</b:Last>
-            <b:First>Zehcen</b:First>
-          </b:Person>
-          <b:Person>
-            <b:Last>Li</b:Last>
-            <b:First>Yang</b:First>
-          </b:Person>
-          <b:Person>
-            <b:Last>Xu</b:Last>
-            <b:First>Yong</b:First>
-          </b:Person>
-          <b:Person>
-            <b:Last>Joshi</b:Last>
-            <b:First>Amrita</b:First>
-          </b:Person>
-          <b:Person>
-            <b:Last>Wang</b:Last>
-            <b:First>Xiaonan</b:First>
-          </b:Person>
-          <b:Person>
-            <b:Last>Ng</b:Last>
-            <b:First>Leonard</b:First>
-            <b:Middle>W. T.</b:Middle>
-          </b:Person>
-          <b:Person>
-            <b:Last>Kalinin</b:Last>
-            <b:First>Sergei</b:First>
-            <b:Middle>V.</b:Middle>
-          </b:Person>
-          <b:Person>
-            <b:Last>Ahmadi</b:Last>
-            <b:First>Mahshid</b:First>
-          </b:Person>
-          <b:Person>
-            <b:Last>Zhang</b:Last>
-            <b:First>Jiyizhe</b:First>
-          </b:Person>
-          <b:Person>
-            <b:Last>Zhang</b:Last>
-            <b:First>Shuyuan</b:First>
-          </b:Person>
-          <b:Person>
-            <b:Last>Lapkin</b:Last>
-            <b:First>Alexei</b:First>
-          </b:Person>
-          <b:Person>
-            <b:Last>Xiao</b:Last>
-            <b:First>Ming</b:First>
-          </b:Person>
-          <b:Person>
-            <b:Last>Wu</b:Last>
-            <b:First>Zhe</b:First>
-          </b:Person>
-          <b:Person>
-            <b:Last>Hippalgaonkar</b:Last>
-            <b:First>Kedar</b:First>
-          </b:Person>
-          <b:Person>
-            <b:Last>Wong</b:Last>
-            <b:First>Limsoon</b:First>
-          </b:Person>
-          <b:Person>
-            <b:Last>Bastonero</b:Last>
-            <b:First>Lorenzo</b:First>
-          </b:Person>
-          <b:Person>
-            <b:Last>Marzari</b:Last>
-            <b:First>Nicola</b:First>
-          </b:Person>
-          <b:Person>
-            <b:Last>Esteras Cordoba</b:Last>
-            <b:First>Dorye</b:First>
-            <b:Middle>Luis</b:Middle>
-          </b:Person>
-          <b:Person>
-            <b:Last>Tomut</b:Last>
-            <b:First>Andrei</b:First>
-          </b:Person>
-          <b:Person>
-            <b:Last>Quinones Andrade</b:Last>
-            <b:First>Alba</b:First>
-          </b:Person>
-          <b:Person>
-            <b:Last>Garcia</b:Last>
-            <b:First>Jose-Hugo</b:First>
-          </b:Person>
-        </b:NameList>
-      </b:Author>
-    </b:Author>
-    <b:Title>Ai4x roadmap: Artificial intelligence for the advancement of scientific pursuit and its future directions</b:Title>
-    <b:Year>2025</b:Year>
-    <b:URL>https://arxiv.org/abs/2511.20976</b:URL>
-    <b:StandardNumber>arXiv:2511.20976</b:StandardNumber>
-    <b:RefOrder>6</b:RefOrder>
-  </b:Source>
-  <b:Source>
     <b:Tag>AI4X_Committee2028</b:Tag>
     <b:SourceType>JournalArticle</b:SourceType>
     <b:Author>
@@ -4544,11 +3721,318 @@
     <b:URL>https://doi.org/10.1038/s41586-020-2442-2</b:URL>
     <b:RefOrder>5</b:RefOrder>
   </b:Source>
+  <b:Source>
+    <b:Tag>AI4X_Roadmap2025</b:Tag>
+    <b:SourceType>Report</b:SourceType>
+    <b:Author>
+      <b:Author>
+        <b:NameList>
+          <b:Person>
+            <b:Last>Dale</b:Last>
+            <b:First>Stephen</b:First>
+            <b:Middle>G.</b:Middle>
+          </b:Person>
+          <b:Person>
+            <b:Last>Kazeev</b:Last>
+            <b:First>Nikita</b:First>
+          </b:Person>
+          <b:Person>
+            <b:Last>Price</b:Last>
+            <b:First>Alastair</b:First>
+            <b:Middle>J. A.</b:Middle>
+          </b:Person>
+          <b:Person>
+            <b:Last>Posligua</b:Last>
+            <b:First>Victor</b:First>
+          </b:Person>
+          <b:Person>
+            <b:Last>Roche</b:Last>
+            <b:First>Stephan</b:First>
+          </b:Person>
+          <b:Person>
+            <b:Last>von Lilienfeld</b:Last>
+            <b:First>O.</b:First>
+            <b:Middle>Anatole</b:Middle>
+          </b:Person>
+          <b:Person>
+            <b:Last>Novoselov</b:Last>
+            <b:First>Konstantin</b:First>
+            <b:Middle>S.</b:Middle>
+          </b:Person>
+          <b:Person>
+            <b:Last>Bresson</b:Last>
+            <b:First>Xavier</b:First>
+          </b:Person>
+          <b:Person>
+            <b:Last>Mengaldo</b:Last>
+            <b:First>Gianmarco</b:First>
+          </b:Person>
+          <b:Person>
+            <b:Last>Chen</b:Last>
+            <b:First>Xudong</b:First>
+          </b:Person>
+          <b:Person>
+            <b:Last>O’Kane</b:Last>
+            <b:First>Terence</b:First>
+            <b:Middle>J.</b:Middle>
+          </b:Person>
+          <b:Person>
+            <b:Last>Lines</b:Last>
+            <b:First>Emily</b:First>
+            <b:Middle>R.</b:Middle>
+          </b:Person>
+          <b:Person>
+            <b:Last>Allen</b:Last>
+            <b:First>Matthew</b:First>
+            <b:Middle>J.</b:Middle>
+          </b:Person>
+          <b:Person>
+            <b:Last>Debus</b:Last>
+            <b:First>Amandine</b:First>
+            <b:Middle>E.</b:Middle>
+          </b:Person>
+          <b:Person>
+            <b:Last>Miller</b:Last>
+            <b:First>Clayton</b:First>
+          </b:Person>
+          <b:Person>
+            <b:Last>Zhou</b:Last>
+            <b:First>Jiayu</b:First>
+          </b:Person>
+          <b:Person>
+            <b:Last>Dodge</b:Last>
+            <b:First>Hiroko</b:First>
+            <b:Middle>H.</b:Middle>
+          </b:Person>
+          <b:Person>
+            <b:Last>Rousseau</b:Last>
+            <b:First>David</b:First>
+          </b:Person>
+          <b:Person>
+            <b:Last>Ustyuzhanin</b:Last>
+            <b:First>Andrey</b:First>
+          </b:Person>
+          <b:Person>
+            <b:Last>Yan</b:Last>
+            <b:First>Ziyun</b:First>
+          </b:Person>
+          <b:Person>
+            <b:Last>Lanza</b:Last>
+            <b:First>Mario</b:First>
+          </b:Person>
+          <b:Person>
+            <b:Last>Sciarrino</b:Last>
+            <b:First>Fabio</b:First>
+          </b:Person>
+          <b:Person>
+            <b:Last>Yoshida</b:Last>
+            <b:First>Ryo</b:First>
+          </b:Person>
+          <b:Person>
+            <b:Last>Leong</b:Last>
+            <b:First>Zhidong</b:First>
+          </b:Person>
+          <b:Person>
+            <b:Last>Tan</b:Last>
+            <b:First>Teck</b:First>
+            <b:Middle>Leong</b:Middle>
+          </b:Person>
+          <b:Person>
+            <b:Last>Li</b:Last>
+            <b:First>Qianxiao</b:First>
+          </b:Person>
+          <b:Person>
+            <b:Last>Kabylda</b:Last>
+            <b:First>Adil</b:First>
+          </b:Person>
+          <b:Person>
+            <b:Last>Poltavsky</b:Last>
+            <b:First>Igor</b:First>
+          </b:Person>
+          <b:Person>
+            <b:Last>Tkatchenko</b:Last>
+            <b:First>Alexandre</b:First>
+          </b:Person>
+          <b:Person>
+            <b:Last>Tawfik</b:Last>
+            <b:First>Sherif</b:First>
+            <b:Middle>Abdulkader</b:Middle>
+          </b:Person>
+          <b:Person>
+            <b:Last>Kamath</b:Last>
+            <b:First>Prathami</b:First>
+            <b:Middle>Divakar</b:Middle>
+          </b:Person>
+          <b:Person>
+            <b:Last>Inizan</b:Last>
+            <b:First>Theo</b:First>
+            <b:Middle>Jaffrelot</b:Middle>
+          </b:Person>
+          <b:Person>
+            <b:Last>Persson</b:Last>
+            <b:First>Kristin</b:First>
+            <b:Middle>A.</b:Middle>
+          </b:Person>
+          <b:Person>
+            <b:Last>Li</b:Last>
+            <b:First>Bryant</b:First>
+            <b:Middle>Y.</b:Middle>
+          </b:Person>
+          <b:Person>
+            <b:Last>Karan</b:Last>
+            <b:First>Vir</b:First>
+          </b:Person>
+          <b:Person>
+            <b:Last>Duan</b:Last>
+            <b:First>Chenru</b:First>
+          </b:Person>
+          <b:Person>
+            <b:Last>Jia</b:Last>
+            <b:First>Haojun</b:First>
+          </b:Person>
+          <b:Person>
+            <b:Last>Zhao</b:Last>
+            <b:First>Qiyuan</b:First>
+          </b:Person>
+          <b:Person>
+            <b:Last>Hayashi</b:Last>
+            <b:First>Hiroyuki</b:First>
+          </b:Person>
+          <b:Person>
+            <b:Last>Seko</b:Last>
+            <b:First>Atsuto</b:First>
+          </b:Person>
+          <b:Person>
+            <b:Last>Tanaka</b:Last>
+            <b:First>Isao</b:First>
+          </b:Person>
+          <b:Person>
+            <b:Last>Yaghi</b:Last>
+            <b:First>Omar</b:First>
+            <b:Middle>M.</b:Middle>
+          </b:Person>
+          <b:Person>
+            <b:Last>Gould</b:Last>
+            <b:First>Tim</b:First>
+          </b:Person>
+          <b:Person>
+            <b:Last>Chan</b:Last>
+            <b:First>Bun</b:First>
+          </b:Person>
+          <b:Person>
+            <b:Last>Vuckovic</b:Last>
+            <b:First>Stefan</b:First>
+          </b:Person>
+          <b:Person>
+            <b:Last>Li</b:Last>
+            <b:First>Tianbo</b:First>
+          </b:Person>
+          <b:Person>
+            <b:Last>Lin</b:Last>
+            <b:First>Min</b:First>
+          </b:Person>
+          <b:Person>
+            <b:Last>Tang</b:Last>
+            <b:First>Zehcen</b:First>
+          </b:Person>
+          <b:Person>
+            <b:Last>Li</b:Last>
+            <b:First>Yang</b:First>
+          </b:Person>
+          <b:Person>
+            <b:Last>Xu</b:Last>
+            <b:First>Yong</b:First>
+          </b:Person>
+          <b:Person>
+            <b:Last>Joshi</b:Last>
+            <b:First>Amrita</b:First>
+          </b:Person>
+          <b:Person>
+            <b:Last>Wang</b:Last>
+            <b:First>Xiaonan</b:First>
+          </b:Person>
+          <b:Person>
+            <b:Last>Ng</b:Last>
+            <b:First>Leonard</b:First>
+            <b:Middle>W. T.</b:Middle>
+          </b:Person>
+          <b:Person>
+            <b:Last>Kalinin</b:Last>
+            <b:First>Sergei</b:First>
+            <b:Middle>V.</b:Middle>
+          </b:Person>
+          <b:Person>
+            <b:Last>Ahmadi</b:Last>
+            <b:First>Mahshid</b:First>
+          </b:Person>
+          <b:Person>
+            <b:Last>Zhang</b:Last>
+            <b:First>Jiyizhe</b:First>
+          </b:Person>
+          <b:Person>
+            <b:Last>Zhang</b:Last>
+            <b:First>Shuyuan</b:First>
+          </b:Person>
+          <b:Person>
+            <b:Last>Lapkin</b:Last>
+            <b:First>Alexei</b:First>
+          </b:Person>
+          <b:Person>
+            <b:Last>Xiao</b:Last>
+            <b:First>Ming</b:First>
+          </b:Person>
+          <b:Person>
+            <b:Last>Wu</b:Last>
+            <b:First>Zhe</b:First>
+          </b:Person>
+          <b:Person>
+            <b:Last>Hippalgaonkar</b:Last>
+            <b:First>Kedar</b:First>
+          </b:Person>
+          <b:Person>
+            <b:Last>Wong</b:Last>
+            <b:First>Limsoon</b:First>
+          </b:Person>
+          <b:Person>
+            <b:Last>Bastonero</b:Last>
+            <b:First>Lorenzo</b:First>
+          </b:Person>
+          <b:Person>
+            <b:Last>Marzari</b:Last>
+            <b:First>Nicola</b:First>
+          </b:Person>
+          <b:Person>
+            <b:Last>Esteras Cordoba</b:Last>
+            <b:First>Dorye</b:First>
+            <b:Middle>Luis</b:Middle>
+          </b:Person>
+          <b:Person>
+            <b:Last>Tomut</b:Last>
+            <b:First>Andrei</b:First>
+          </b:Person>
+          <b:Person>
+            <b:Last>Quinones Andrade</b:Last>
+            <b:First>Alba</b:First>
+          </b:Person>
+          <b:Person>
+            <b:Last>Garcia</b:Last>
+            <b:First>Jose-Hugo</b:First>
+          </b:Person>
+        </b:NameList>
+      </b:Author>
+    </b:Author>
+    <b:Title>AI4X roadmap: Artificial intelligence for the advancement of scientific pursuit and its future directions</b:Title>
+    <b:Year>2025</b:Year>
+    <b:URL>https://arxiv.org/abs/2511.20976</b:URL>
+    <b:StandardNumber>arXiv:2511.20976</b:StandardNumber>
+    <b:Guid>{CC21A67A-573A-47FF-8670-7E92309B1B0D}</b:Guid>
+    <b:RefOrder>6</b:RefOrder>
+  </b:Source>
 </b:Sources>
 </file>
 
 <file path=customXml/itemProps1.xml><?xml version="1.0" encoding="utf-8"?>
-<ds:datastoreItem xmlns:ds="http://schemas.openxmlformats.org/officeDocument/2006/customXml" ds:itemID="{9DC85235-CF34-4759-965B-36C81F2E1985}">
+<ds:datastoreItem xmlns:ds="http://schemas.openxmlformats.org/officeDocument/2006/customXml" ds:itemID="{02E33FD9-19E3-4F25-9BF6-EC053C7996F3}">
   <ds:schemaRefs>
     <ds:schemaRef ds:uri="http://schemas.openxmlformats.org/officeDocument/2006/bibliography"/>
   </ds:schemaRefs>

</xml_diff>